<commit_message>
Pre-entrega 3: login con JWT, cookie httpOnly, ruta current y logout
</commit_message>
<xml_diff>
--- a/docs/Doc1.docx
+++ b/docs/Doc1.docx
@@ -3,12 +3,23 @@
 <w:document xmlns:wpc="http://schemas.microsoft.com/office/word/2010/wordprocessingCanvas" xmlns:cx="http://schemas.microsoft.com/office/drawing/2014/chartex" xmlns:cx1="http://schemas.microsoft.com/office/drawing/2015/9/8/chartex" xmlns:cx2="http://schemas.microsoft.com/office/drawing/2015/10/21/chartex" xmlns:cx3="http://schemas.microsoft.com/office/drawing/2016/5/9/chartex" xmlns:cx4="http://schemas.microsoft.com/office/drawing/2016/5/10/chartex" xmlns:cx5="http://schemas.microsoft.com/office/drawing/2016/5/11/chartex" xmlns:cx6="http://schemas.microsoft.com/office/drawing/2016/5/12/chartex" xmlns:cx7="http://schemas.microsoft.com/office/drawing/2016/5/13/chartex" xmlns:cx8="http://schemas.microsoft.com/office/drawing/2016/5/14/chartex" xmlns:mc="http://schemas.openxmlformats.org/markup-compatibility/2006" xmlns:aink="http://schemas.microsoft.com/office/drawing/2016/ink" xmlns:am3d="http://schemas.microsoft.com/office/drawing/2017/model3d" xmlns:o="urn:schemas-microsoft-com:office:office" xmlns:r="http://schemas.openxmlformats.org/officeDocument/2006/relationships" xmlns:m="http://schemas.openxmlformats.org/officeDocument/2006/math" xmlns:v="urn:schemas-microsoft-com:vml" xmlns:wp14="http://schemas.microsoft.com/office/word/2010/wordprocessingDrawing" xmlns:wp="http://schemas.openxmlformats.org/drawingml/2006/wordprocessingDrawing" xmlns:w10="urn:schemas-microsoft-com:office:word" xmlns:w="http://schemas.openxmlformats.org/wordprocessingml/2006/main" xmlns:w14="http://schemas.microsoft.com/office/word/2010/wordml" xmlns:w15="http://schemas.microsoft.com/office/word/2012/wordml" xmlns:w16cid="http://schemas.microsoft.com/office/word/2016/wordml/cid" xmlns:w16se="http://schemas.microsoft.com/office/word/2015/wordml/symex" xmlns:wpg="http://schemas.microsoft.com/office/word/2010/wordprocessingGroup" xmlns:wpi="http://schemas.microsoft.com/office/word/2010/wordprocessingInk" xmlns:wne="http://schemas.microsoft.com/office/word/2006/wordml" xmlns:wps="http://schemas.microsoft.com/office/word/2010/wordprocessingShape" mc:Ignorable="w14 w15 w16se w16cid wp14">
   <w:body>
     <w:p>
+      <w:pPr>
+        <w:rPr>
+          <w:noProof/>
+        </w:rPr>
+      </w:pPr>
       <w:r>
         <w:rPr>
           <w:noProof/>
         </w:rPr>
+        <w:t>2</w:t>
+      </w:r>
+      <w:r>
+        <w:rPr>
+          <w:noProof/>
+        </w:rPr>
         <w:drawing>
-          <wp:inline distT="0" distB="0" distL="0" distR="0" wp14:anchorId="29052FAD" wp14:editId="1A235327">
+          <wp:inline distT="0" distB="0" distL="0" distR="0" wp14:anchorId="14A49E5D" wp14:editId="0A5C122E">
             <wp:extent cx="5400040" cy="3035935"/>
             <wp:effectExtent l="0" t="0" r="0" b="0"/>
             <wp:docPr id="4" name="Imagen 4"/>
@@ -129,10 +140,10 @@
           <w:noProof/>
         </w:rPr>
         <w:drawing>
-          <wp:inline distT="0" distB="0" distL="0" distR="0" wp14:anchorId="5AE514FE" wp14:editId="6320A964">
+          <wp:inline distT="0" distB="0" distL="0" distR="0" wp14:anchorId="3793F36D" wp14:editId="41EE67FA">
             <wp:extent cx="5400040" cy="3035935"/>
             <wp:effectExtent l="0" t="0" r="0" b="0"/>
-            <wp:docPr id="6" name="Imagen 6"/>
+            <wp:docPr id="1" name="Imagen 1"/>
             <wp:cNvGraphicFramePr>
               <a:graphicFrameLocks xmlns:a="http://schemas.openxmlformats.org/drawingml/2006/main" noChangeAspect="1"/>
             </wp:cNvGraphicFramePr>
@@ -164,18 +175,16 @@
           </wp:inline>
         </w:drawing>
       </w:r>
-      <w:bookmarkStart w:id="0" w:name="_GoBack"/>
-      <w:bookmarkEnd w:id="0"/>
       <w:r>
         <w:rPr>
           <w:noProof/>
         </w:rPr>
         <w:lastRenderedPageBreak/>
         <w:drawing>
-          <wp:inline distT="0" distB="0" distL="0" distR="0" wp14:anchorId="550DDF08" wp14:editId="797624B5">
+          <wp:inline distT="0" distB="0" distL="0" distR="0" wp14:anchorId="5AE514FE" wp14:editId="6320A964">
             <wp:extent cx="5400040" cy="3035935"/>
             <wp:effectExtent l="0" t="0" r="0" b="0"/>
-            <wp:docPr id="1" name="Imagen 1"/>
+            <wp:docPr id="6" name="Imagen 6"/>
             <wp:cNvGraphicFramePr>
               <a:graphicFrameLocks xmlns:a="http://schemas.openxmlformats.org/drawingml/2006/main" noChangeAspect="1"/>
             </wp:cNvGraphicFramePr>
@@ -188,6 +197,259 @@
                   </pic:nvPicPr>
                   <pic:blipFill>
                     <a:blip r:embed="rId8"/>
+                    <a:stretch>
+                      <a:fillRect/>
+                    </a:stretch>
+                  </pic:blipFill>
+                  <pic:spPr>
+                    <a:xfrm>
+                      <a:off x="0" y="0"/>
+                      <a:ext cx="5400040" cy="3035935"/>
+                    </a:xfrm>
+                    <a:prstGeom prst="rect">
+                      <a:avLst/>
+                    </a:prstGeom>
+                  </pic:spPr>
+                </pic:pic>
+              </a:graphicData>
+            </a:graphic>
+          </wp:inline>
+        </w:drawing>
+      </w:r>
+      <w:r>
+        <w:rPr>
+          <w:noProof/>
+        </w:rPr>
+        <w:t>3</w:t>
+      </w:r>
+    </w:p>
+    <w:p>
+      <w:r>
+        <w:rPr>
+          <w:noProof/>
+        </w:rPr>
+        <w:lastRenderedPageBreak/>
+        <w:drawing>
+          <wp:inline distT="0" distB="0" distL="0" distR="0" wp14:anchorId="01425827" wp14:editId="228F93DF">
+            <wp:extent cx="5400040" cy="3035935"/>
+            <wp:effectExtent l="0" t="0" r="0" b="0"/>
+            <wp:docPr id="7" name="Imagen 7"/>
+            <wp:cNvGraphicFramePr>
+              <a:graphicFrameLocks xmlns:a="http://schemas.openxmlformats.org/drawingml/2006/main" noChangeAspect="1"/>
+            </wp:cNvGraphicFramePr>
+            <a:graphic xmlns:a="http://schemas.openxmlformats.org/drawingml/2006/main">
+              <a:graphicData uri="http://schemas.openxmlformats.org/drawingml/2006/picture">
+                <pic:pic xmlns:pic="http://schemas.openxmlformats.org/drawingml/2006/picture">
+                  <pic:nvPicPr>
+                    <pic:cNvPr id="1" name=""/>
+                    <pic:cNvPicPr/>
+                  </pic:nvPicPr>
+                  <pic:blipFill>
+                    <a:blip r:embed="rId9"/>
+                    <a:stretch>
+                      <a:fillRect/>
+                    </a:stretch>
+                  </pic:blipFill>
+                  <pic:spPr>
+                    <a:xfrm>
+                      <a:off x="0" y="0"/>
+                      <a:ext cx="5400040" cy="3035935"/>
+                    </a:xfrm>
+                    <a:prstGeom prst="rect">
+                      <a:avLst/>
+                    </a:prstGeom>
+                  </pic:spPr>
+                </pic:pic>
+              </a:graphicData>
+            </a:graphic>
+          </wp:inline>
+        </w:drawing>
+      </w:r>
+      <w:r>
+        <w:rPr>
+          <w:noProof/>
+        </w:rPr>
+        <w:drawing>
+          <wp:inline distT="0" distB="0" distL="0" distR="0" wp14:anchorId="5BA3BF69" wp14:editId="258A49ED">
+            <wp:extent cx="5400040" cy="3035935"/>
+            <wp:effectExtent l="0" t="0" r="0" b="0"/>
+            <wp:docPr id="8" name="Imagen 8"/>
+            <wp:cNvGraphicFramePr>
+              <a:graphicFrameLocks xmlns:a="http://schemas.openxmlformats.org/drawingml/2006/main" noChangeAspect="1"/>
+            </wp:cNvGraphicFramePr>
+            <a:graphic xmlns:a="http://schemas.openxmlformats.org/drawingml/2006/main">
+              <a:graphicData uri="http://schemas.openxmlformats.org/drawingml/2006/picture">
+                <pic:pic xmlns:pic="http://schemas.openxmlformats.org/drawingml/2006/picture">
+                  <pic:nvPicPr>
+                    <pic:cNvPr id="1" name=""/>
+                    <pic:cNvPicPr/>
+                  </pic:nvPicPr>
+                  <pic:blipFill>
+                    <a:blip r:embed="rId10"/>
+                    <a:stretch>
+                      <a:fillRect/>
+                    </a:stretch>
+                  </pic:blipFill>
+                  <pic:spPr>
+                    <a:xfrm>
+                      <a:off x="0" y="0"/>
+                      <a:ext cx="5400040" cy="3035935"/>
+                    </a:xfrm>
+                    <a:prstGeom prst="rect">
+                      <a:avLst/>
+                    </a:prstGeom>
+                  </pic:spPr>
+                </pic:pic>
+              </a:graphicData>
+            </a:graphic>
+          </wp:inline>
+        </w:drawing>
+      </w:r>
+      <w:bookmarkStart w:id="0" w:name="_GoBack"/>
+      <w:bookmarkEnd w:id="0"/>
+      <w:r>
+        <w:rPr>
+          <w:noProof/>
+        </w:rPr>
+        <w:lastRenderedPageBreak/>
+        <w:drawing>
+          <wp:inline distT="0" distB="0" distL="0" distR="0" wp14:anchorId="7B571FA6" wp14:editId="0532ACA5">
+            <wp:extent cx="5400040" cy="3035935"/>
+            <wp:effectExtent l="0" t="0" r="0" b="0"/>
+            <wp:docPr id="9" name="Imagen 9"/>
+            <wp:cNvGraphicFramePr>
+              <a:graphicFrameLocks xmlns:a="http://schemas.openxmlformats.org/drawingml/2006/main" noChangeAspect="1"/>
+            </wp:cNvGraphicFramePr>
+            <a:graphic xmlns:a="http://schemas.openxmlformats.org/drawingml/2006/main">
+              <a:graphicData uri="http://schemas.openxmlformats.org/drawingml/2006/picture">
+                <pic:pic xmlns:pic="http://schemas.openxmlformats.org/drawingml/2006/picture">
+                  <pic:nvPicPr>
+                    <pic:cNvPr id="1" name=""/>
+                    <pic:cNvPicPr/>
+                  </pic:nvPicPr>
+                  <pic:blipFill>
+                    <a:blip r:embed="rId11"/>
+                    <a:stretch>
+                      <a:fillRect/>
+                    </a:stretch>
+                  </pic:blipFill>
+                  <pic:spPr>
+                    <a:xfrm>
+                      <a:off x="0" y="0"/>
+                      <a:ext cx="5400040" cy="3035935"/>
+                    </a:xfrm>
+                    <a:prstGeom prst="rect">
+                      <a:avLst/>
+                    </a:prstGeom>
+                  </pic:spPr>
+                </pic:pic>
+              </a:graphicData>
+            </a:graphic>
+          </wp:inline>
+        </w:drawing>
+      </w:r>
+      <w:r>
+        <w:rPr>
+          <w:noProof/>
+        </w:rPr>
+        <w:drawing>
+          <wp:inline distT="0" distB="0" distL="0" distR="0" wp14:anchorId="05B3D711" wp14:editId="1FB5712D">
+            <wp:extent cx="5400040" cy="3035935"/>
+            <wp:effectExtent l="0" t="0" r="0" b="0"/>
+            <wp:docPr id="11" name="Imagen 11"/>
+            <wp:cNvGraphicFramePr>
+              <a:graphicFrameLocks xmlns:a="http://schemas.openxmlformats.org/drawingml/2006/main" noChangeAspect="1"/>
+            </wp:cNvGraphicFramePr>
+            <a:graphic xmlns:a="http://schemas.openxmlformats.org/drawingml/2006/main">
+              <a:graphicData uri="http://schemas.openxmlformats.org/drawingml/2006/picture">
+                <pic:pic xmlns:pic="http://schemas.openxmlformats.org/drawingml/2006/picture">
+                  <pic:nvPicPr>
+                    <pic:cNvPr id="1" name=""/>
+                    <pic:cNvPicPr/>
+                  </pic:nvPicPr>
+                  <pic:blipFill>
+                    <a:blip r:embed="rId12"/>
+                    <a:stretch>
+                      <a:fillRect/>
+                    </a:stretch>
+                  </pic:blipFill>
+                  <pic:spPr>
+                    <a:xfrm>
+                      <a:off x="0" y="0"/>
+                      <a:ext cx="5400040" cy="3035935"/>
+                    </a:xfrm>
+                    <a:prstGeom prst="rect">
+                      <a:avLst/>
+                    </a:prstGeom>
+                  </pic:spPr>
+                </pic:pic>
+              </a:graphicData>
+            </a:graphic>
+          </wp:inline>
+        </w:drawing>
+      </w:r>
+      <w:r>
+        <w:rPr>
+          <w:noProof/>
+        </w:rPr>
+        <w:lastRenderedPageBreak/>
+        <w:drawing>
+          <wp:inline distT="0" distB="0" distL="0" distR="0" wp14:anchorId="6AE73679" wp14:editId="5794E5CC">
+            <wp:extent cx="5400040" cy="3035935"/>
+            <wp:effectExtent l="0" t="0" r="0" b="0"/>
+            <wp:docPr id="13" name="Imagen 13"/>
+            <wp:cNvGraphicFramePr>
+              <a:graphicFrameLocks xmlns:a="http://schemas.openxmlformats.org/drawingml/2006/main" noChangeAspect="1"/>
+            </wp:cNvGraphicFramePr>
+            <a:graphic xmlns:a="http://schemas.openxmlformats.org/drawingml/2006/main">
+              <a:graphicData uri="http://schemas.openxmlformats.org/drawingml/2006/picture">
+                <pic:pic xmlns:pic="http://schemas.openxmlformats.org/drawingml/2006/picture">
+                  <pic:nvPicPr>
+                    <pic:cNvPr id="1" name=""/>
+                    <pic:cNvPicPr/>
+                  </pic:nvPicPr>
+                  <pic:blipFill>
+                    <a:blip r:embed="rId13"/>
+                    <a:stretch>
+                      <a:fillRect/>
+                    </a:stretch>
+                  </pic:blipFill>
+                  <pic:spPr>
+                    <a:xfrm>
+                      <a:off x="0" y="0"/>
+                      <a:ext cx="5400040" cy="3035935"/>
+                    </a:xfrm>
+                    <a:prstGeom prst="rect">
+                      <a:avLst/>
+                    </a:prstGeom>
+                  </pic:spPr>
+                </pic:pic>
+              </a:graphicData>
+            </a:graphic>
+          </wp:inline>
+        </w:drawing>
+      </w:r>
+      <w:r>
+        <w:rPr>
+          <w:noProof/>
+        </w:rPr>
+        <w:drawing>
+          <wp:inline distT="0" distB="0" distL="0" distR="0" wp14:anchorId="1E53C588" wp14:editId="7FE419A3">
+            <wp:extent cx="5400040" cy="3035935"/>
+            <wp:effectExtent l="0" t="0" r="0" b="0"/>
+            <wp:docPr id="10" name="Imagen 10"/>
+            <wp:cNvGraphicFramePr>
+              <a:graphicFrameLocks xmlns:a="http://schemas.openxmlformats.org/drawingml/2006/main" noChangeAspect="1"/>
+            </wp:cNvGraphicFramePr>
+            <a:graphic xmlns:a="http://schemas.openxmlformats.org/drawingml/2006/main">
+              <a:graphicData uri="http://schemas.openxmlformats.org/drawingml/2006/picture">
+                <pic:pic xmlns:pic="http://schemas.openxmlformats.org/drawingml/2006/picture">
+                  <pic:nvPicPr>
+                    <pic:cNvPr id="1" name=""/>
+                    <pic:cNvPicPr/>
+                  </pic:nvPicPr>
+                  <pic:blipFill>
+                    <a:blip r:embed="rId14"/>
                     <a:stretch>
                       <a:fillRect/>
                     </a:stretch>

</xml_diff>